<commit_message>
Correct management pack approval wording
</commit_message>
<xml_diff>
--- a/tentativedemodocs/DWI-Prompt-Optimizer-Management-Brief.docx
+++ b/tentativedemodocs/DWI-Prompt-Optimizer-Management-Brief.docx
@@ -272,7 +272,7 @@
         <w:rPr>
           <w:b w:val="0"/>
         </w:rPr>
-        <w:t>Phase 4 exposed a clear decision-governance failure. The product owner approved maximum calls, no retries, and monetary ceilings. During contract preparation, 20,000 aggregate and 12,000 per-call token ceilings were added without explicit owner approval. The 12,000 ceiling then became pivotal execution logic and stopped the evaluation.</w:t>
+        <w:t>Phase 4 exposed a clear decision-governance failure. The human approver approved maximum calls, no retries, and monetary ceilings. During contract preparation, 20,000 aggregate and 12,000 per-call token ceilings were added without explicit approval from the human approver. The 12,000 ceiling then became pivotal execution logic and stopped the evaluation.</w:t>
       </w:r>
     </w:p>
     <w:p>
@@ -280,7 +280,7 @@
         <w:rPr>
           <w:b w:val="0"/>
         </w:rPr>
-        <w:t>The stop control did what it was coded to do: it halted after the 14,531-token readiness response and preserved the evidence. The decision process failed earlier. A number must not gain business authority merely because it appears in code or configuration—even when produced by a multiplier. Any rule that can change execution, cost, data sharing, or a phase outcome must trace to an approved requirement, named owner, explainable calculation, version, test, and rollback.</w:t>
+        <w:t>The stop control did what it was coded to do: it halted after the 14,531-token readiness response and preserved the evidence. The decision process failed earlier. A number must not gain business authority merely because it appears in code or configuration—even when produced by a multiplier. Any rule that can change execution, cost, data sharing, or a phase outcome must trace to an approved requirement, named human approver, explainable calculation, version, test, and rollback.</w:t>
       </w:r>
     </w:p>
     <w:p>
@@ -288,7 +288,7 @@
         <w:rPr>
           <w:b w:val="0"/>
         </w:rPr>
-        <w:t>Phase 4 remains deliberately frozen. The owner did not authorize a retry or ceiling increase, and the AI assistant did not perform either action, so this failure could not be tuned into a convenient pass. Before development resumes, DWI needs an audit of every pivotal limit, default, multiplier, exception, and fallback that may have entered silently. No prompt-quality conclusion can be drawn because the comparison never began; quality remains unmeasured.</w:t>
+        <w:t>Phase 4 remains deliberately frozen. The human approver did not authorize a retry or ceiling increase, and the AI assistant did not perform either action, so this failure could not be tuned into a convenient pass. Before development resumes, DWI needs an audit of every pivotal limit, default, multiplier, exception, and fallback that may have entered silently. No prompt-quality conclusion can be drawn because the comparison never began; quality remains unmeasured.</w:t>
       </w:r>
     </w:p>
     <w:p>
@@ -305,26 +305,6 @@
           <w:b w:val="0"/>
         </w:rPr>
         <w:t>These future features are not built today. An adaptive usage allowance would never authorize spending or external AI use, and feedback would improve tools, training, and delivery practices—not rank or monitor individual employees.</w:t>
-      </w:r>
-    </w:p>
-    <w:p>
-      <w:pPr>
-        <w:pStyle w:val="Heading2"/>
-        <w:keepNext/>
-      </w:pPr>
-      <w:r>
-        <w:rPr>
-          <w:b w:val="0"/>
-        </w:rPr>
-        <w:t>Recommendation</w:t>
-      </w:r>
-    </w:p>
-    <w:p>
-      <w:r>
-        <w:rPr>
-          <w:b w:val="0"/>
-        </w:rPr>
-        <w:t>Use this report and the existing product evidence for a focused four-day management proof of concept rather than restarting a four-month discovery exercise. This is a planning target, not a production-delivery promise. Keep Phase 4 frozen, complete the decision-rule audit, design an approval-led adaptive accounting mechanism, and prove it in dry-run mode before separately authorizing any live comparison or pilot.</w:t>
       </w:r>
     </w:p>
     <w:p>
@@ -2616,7 +2596,7 @@
         <w:rPr>
           <w:b w:val="0"/>
         </w:rPr>
-        <w:t>The owner approved the provider route and synthetic inputs, maximum calls, no retries, and monetary ceilings. During contract preparation, the AI assistant added 20,000 aggregate, 120,000 evaluation, and 12,000 per-completion token ceilings without explicit owner approval. The program record then described the combined bounds as user-supplied. That attribution is not supported by the retained approval message.</w:t>
+        <w:t>The human approver approved the provider route and synthetic inputs, maximum calls, no retries, and monetary ceilings. During contract preparation, the AI assistant added 20,000 aggregate, 120,000 evaluation, and 12,000 per-completion token ceilings without explicit approval from the human approver. The program record then described the combined bounds as user-supplied. That attribution is not supported by the retained approval message.</w:t>
       </w:r>
     </w:p>
     <w:p>
@@ -2648,7 +2628,7 @@
         <w:rPr>
           <w:b w:val="0"/>
         </w:rPr>
-        <w:t>The failure remains intentionally visible. Phase 4 stays deferred with no retry and no ceiling change while DWI audits every decision-bearing limit, default, multiplier, exception, routing choice, data rule, fallback, scoring threshold, and phase gate. Each must have a business source, named owner, explicit approval, explainable derivation, version, test, and rollback. Missing authority must stop execution before an external call.</w:t>
+        <w:t>The failure remains intentionally visible. Phase 4 stays deferred with no retry and no ceiling change while DWI audits every decision-bearing limit, default, multiplier, exception, routing choice, data rule, fallback, scoring threshold, and phase gate. Each must have a business source, named human approver, explicit approval, explainable derivation, version, test, and rollback. Missing authority must stop execution before an external call.</w:t>
       </w:r>
     </w:p>
     <w:p>
@@ -4569,18 +4549,7 @@
         <w:rPr>
           <w:b w:val="0"/>
         </w:rPr>
-        <w:t>Stage 1 — Run a focused four-day management proof of concept</w:t>
-      </w:r>
-    </w:p>
-    <w:p>
-      <w:pPr>
-        <w:pStyle w:val="ListBullet"/>
-      </w:pPr>
-      <w:r>
-        <w:rPr>
-          <w:b w:val="0"/>
-        </w:rPr>
-        <w:t>reuse the current product, evidence, and consolidated report rather than restart discovery;</w:t>
+        <w:t>Stage 1 — Try the current local demo</w:t>
       </w:r>
     </w:p>
     <w:p>
@@ -4624,7 +4593,7 @@
         <w:rPr>
           <w:b w:val="0"/>
         </w:rPr>
-        <w:t>decide whether the idea is useful enough to continue; this four-day target is not a production-delivery promise.</w:t>
+        <w:t>decide whether the idea is useful enough to continue.</w:t>
       </w:r>
     </w:p>
     <w:p>
@@ -4725,7 +4694,7 @@
         <w:rPr>
           <w:b w:val="0"/>
         </w:rPr>
-        <w:t>give each pivotal rule a source, named owner, explicit approval, version, test, and rollback;</w:t>
+        <w:t>give each pivotal rule a source, named human approver, explicit approval, version, test, and rollback;</w:t>
       </w:r>
     </w:p>
     <w:p>
@@ -4929,7 +4898,7 @@
         <w:rPr>
           <w:b w:val="0"/>
         </w:rPr>
-        <w:t>Run the focused four-day management proof of concept and decide whether the demonstrated value justifies the formal decision-rule audit and a dry-run of an explicitly approved adaptive-accounting model.</w:t>
+        <w:t>Experience the current local proof of concept and decide whether it is useful enough to justify completing the core experience and designing a small dry-run.</w:t>
       </w:r>
     </w:p>
     <w:p>
@@ -5074,7 +5043,7 @@
         <w:rPr>
           <w:b w:val="0"/>
         </w:rPr>
-        <w:t>Which pivotal decisions require a named owner and explicit approval?</w:t>
+        <w:t>Which pivotal decisions require a named human approver and explicit approval?</w:t>
       </w:r>
     </w:p>
     <w:p>
@@ -5107,7 +5076,7 @@
         <w:rPr>
           <w:b w:val="0"/>
         </w:rPr>
-        <w:t>Who owns approval, dry-run authorization, and the stop decision?</w:t>
+        <w:t>Who is the human approver for the rule, dry-run authorization, and stop decision?</w:t>
       </w:r>
     </w:p>
     <w:p>
@@ -5155,7 +5124,7 @@
                 <w:color w:val="17365D"/>
                 <w:sz w:val="18"/>
               </w:rPr>
-              <w:t>Does the demonstrated value justify a four-day management proof of concept and a formal decision-governance audit before Phase 4 resumes?</w:t>
+              <w:t>Is the current workflow useful enough to justify a small, controlled dry-run of the future project-management, AI-limit, and feedback model?</w:t>
             </w:r>
           </w:p>
         </w:tc>
@@ -5853,7 +5822,7 @@
         <w:rPr>
           <w:b w:val="0"/>
         </w:rPr>
-        <w:t>The readiness request was authorized, but the 20,000 aggregate, 120,000 evaluation, and 12,000 per-completion token ceilings were introduced during contract preparation by the AI assistant without explicit owner approval. The response reported 14,531 tokens, and the 12,000 sub-limit stopped the process before any business task, optimized output, or quality comparison. The stop and evidence preservation were correct containment; allowing an unapproved number to gain pivotal authority was a clear governance failure. Prompt quality remains unmeasured.</w:t>
+        <w:t>The readiness request was authorized, but the 20,000 aggregate, 120,000 evaluation, and 12,000 per-completion token ceilings were introduced during contract preparation by the AI assistant without explicit approval from the human approver. The response reported 14,531 tokens, and the 12,000 sub-limit stopped the process before any business task, optimized output, or quality comparison. The stop and evidence preservation were correct containment; allowing an unapproved number to gain pivotal authority was a clear governance failure. Prompt quality remains unmeasured.</w:t>
       </w:r>
     </w:p>
     <w:p>
@@ -6181,7 +6150,7 @@
                 <w:color w:val="172033"/>
                 <w:sz w:val="15"/>
               </w:rPr>
-              <w:t>A pivotal rule stopped work and shaped usage logic without owner approval</w:t>
+              <w:t>A pivotal rule stopped work and shaped usage logic without approval from the human approver</w:t>
             </w:r>
           </w:p>
         </w:tc>
@@ -7364,7 +7333,7 @@
                 <w:color w:val="172033"/>
                 <w:sz w:val="15"/>
               </w:rPr>
-              <w:t>The owner, approved requirement, reason, calculation, version, test, and rollback behind a pivotal rule</w:t>
+              <w:t>The human approver, approved requirement, reason, calculation, version, test, and rollback behind a pivotal rule</w:t>
             </w:r>
           </w:p>
         </w:tc>

</xml_diff>